<commit_message>
Fill Kupishuz answers from the Lamoda interview.
Krylatskaya recordings are Lamoda, not Areal. The company file and the summary column now use those answers, and Areal no longer includes Lamoda-only details.

Co-authored-by: lysakalenushka-hash <lysakalenushka-hash@users.noreply.github.com>
</commit_message>
<xml_diff>
--- a/транскрипции/Ответы по вопросам/Ареал.docx
+++ b/транскрипции/Ответы по вопросам/Ареал.docx
@@ -56,7 +56,7 @@
           <w:i w:val="0"/>
           <w:sz w:val="24"/>
         </w:rPr>
-        <w:t>Источники: Новая запись 62; Крылатская улица (2) — более чистый микрофон той же выездной встречи 9 октября. Тексты: расшифровка ASR, не дословный протокол.</w:t>
+        <w:t>Источники: Новая запись 62. Текст: расшифровка ASR, не дословный протокол.</w:t>
       </w:r>
     </w:p>
     <w:p>
@@ -70,7 +70,7 @@
           <w:i w:val="0"/>
           <w:sz w:val="24"/>
         </w:rPr>
-        <w:t>На записи много речи исследователей (про Минтруд, госключ, судебную практику). В ответы взяты реплики стороны компании. Обрывки, где нельзя понять, кто говорит, в ответ не включались. Фрагмент про тысячу ПВЗ к ответам «Ареала» не отнесён.</w:t>
+        <w:t>На записи много речи исследователей (про Минтруд, госключ, судебную практику). В ответы взяты реплики стороны компании. Записи «Крылатская улица» к «Ареалу» не относятся: это интервью КУПИШУЗ (Lamoda).</w:t>
       </w:r>
     </w:p>
     <w:p>
@@ -140,7 +140,7 @@
           <w:i w:val="0"/>
           <w:sz w:val="24"/>
         </w:rPr>
-        <w:t>Ответ: Кржижановский и коллеги со стороны охраны труда показывают, как на предприятиях устроены ознакомление, подписание и учёт, и обсуждают выбор системы. Личный перечень документов и формальное участие во внедрении конкретной СЭД в записи не названы: компания на этапе выбора системы и описания процессов верхнего уровня. В разговоре рядом кадры (блоки документов при приёме и переводе), информационная безопасность, площадки и горные мастера, а также внешние контуры обучения и спецоценки.</w:t>
+        <w:t>Ответ: Кржижановский и коллеги со стороны охраны труда показывают, как на предприятиях устроены ознакомление, подписание и учёт, и обсуждают выбор системы. Личный перечень документов и формальное участие во внедрении конкретной СЭД в записи не названы: компания на этапе выбора системы и описания процессов верхнего уровня. В разговоре рядом информационная безопасность, площадки и горные мастера, а также внешние контуры обучения и спецоценки.</w:t>
       </w:r>
     </w:p>
     <w:p>
@@ -196,7 +196,7 @@
           <w:i w:val="0"/>
           <w:sz w:val="24"/>
         </w:rPr>
-        <w:t>Ответ: Точный год старта и инициатор не названы. Уже есть подписание приказов и ознакомление в КЭДО. Личные карточки по охране труда в электронный документооборот ещё не переведены целиком, этим занимается проектная команда; электронное подписание, по их словам, только стартует, а целевая доля — 100%. Причина, которая звучит: объём бумаги и ознакомлений (на разных предприятиях от 21 до 45 документов на человека), движение персонала и работа горного мастера вне кабинета. Это и отдельный контур охраны труда, и часть общей цифровизации: рядом SAP, 1С, согласование ЛНА и кадровые процессы.</w:t>
+        <w:t>Ответ: Точный год старта и инициатор не названы. Уже есть подписание приказов и ознакомление в КЭДО. Причина, которая звучит: объём бумаги и ознакомлений (на разных предприятиях от 21 до 45 документов на человека), движение персонала и работа горного мастера вне кабинета. Это и отдельный контур охраны труда, и часть общей цифровизации: рядом SAP, 1С, согласование ЛНА и кадровые процессы.</w:t>
       </w:r>
     </w:p>
     <w:p>
@@ -420,7 +420,7 @@
           <w:i w:val="0"/>
           <w:sz w:val="24"/>
         </w:rPr>
-        <w:t>Ответ: Хотят, но система пока не даёт сквозной наряд: чтобы подтянулись заявка на спецодежду, срок стажировки и наставник. Сейчас это сбор в Excel, автоматизацией они это не считают. Личные карточки по охране труда проектная команда ещё не довела. По спецоценке в их контуре нет опции приложить файл подписи эксперта к той же карте, фраза об этом обрывочная. Удалось перевести ознакомление с локальными актами в КЭДО и на части предприятий выдавать электронное задание с идентификацией по карте.</w:t>
+        <w:t>Ответ: Хотят, но система пока не даёт сквозной наряд: чтобы подтянулись заявка на спецодежду, срок стажировки и наставник. Сейчас это сбор в Excel, автоматизацией они это не считают. По спецоценке в их контуре нет опции приложить файл подписи эксперта к той же карте, фраза об этом обрывочная. Удалось перевести ознакомление с локальными актами в КЭДО и на части предприятий выдавать электронное задание с идентификацией по карте.</w:t>
       </w:r>
     </w:p>
     <w:p>
@@ -532,7 +532,7 @@
           <w:i w:val="0"/>
           <w:sz w:val="24"/>
         </w:rPr>
-        <w:t>Ответ: Полного списка нет. В электронном виде ходят ознакомление с локальными актами и утверждение приказов и документов в КЭДО. На части предприятий есть электронное задание с идентификацией по карте. Почему эти: много людей, текучка и перестановки, без системы это не проконтролировать. Личные карточки по охране труда к полностью электронным они не относят.</w:t>
+        <w:t>Ответ: Полного списка нет. В электронном виде ходят ознакомление с локальными актами и утверждение приказов и документов в КЭДО. На части предприятий есть электронное задание с идентификацией по карте. Почему эти: много людей, текучка и перестановки, без системы это не проконтролировать.</w:t>
       </w:r>
     </w:p>
     <w:p>
@@ -588,7 +588,7 @@
           <w:i w:val="0"/>
           <w:sz w:val="24"/>
         </w:rPr>
-        <w:t>Ответ: Закрытого списка «только бумага» нет. Бумага остаётся там, где процесса в системе ещё нет: личные карточки, сквозной наряд, часть спецоценки. Отдельно — площадка без связи: перед выездом на карьер подписать негде, горный мастер не сидит в кабинете. Оригиналы по спецоценке люди по-прежнему просят. Причина в записи: нет устойчивой связи, нет готового процесса и жёсткая политика информационной безопасности.</w:t>
+        <w:t>Ответ: Закрытого списка «только бумага» нет. Бумага остаётся там, где процесса в системе ещё нет: сквозной наряд и часть спецоценки. Отдельно — площадка без связи: перед выездом на карьер подписать негде, горный мастер не сидит в кабинете. Оригиналы по спецоценке люди по-прежнему просят. Причина в записи: нет устойчивой связи, нет готового процесса и жёсткая политика информационной безопасности.</w:t>
       </w:r>
     </w:p>
     <w:p>
@@ -700,7 +700,7 @@
           <w:i w:val="0"/>
           <w:sz w:val="24"/>
         </w:rPr>
-        <w:t>Ответ: Да. Сквозной наряд со спецодеждой, стажировкой и наставником — пока Excel. Личные карточки не доведены. Инструктажи, ознакомление в поле и обучение они относят к процессам, которые надо переводить, но не хотят завязывать на внешний контур. Мешают отсутствие понятных правил, запрет выносить документы наружу, нет связи на карьере и несвязанные системы. Чтобы сдвинуться, им нужны правила до затрат, подпись внутри своей системы «нажал и подписал» и связь либо отдельный порядок для выезда.</w:t>
+        <w:t>Ответ: Да. Сквозной наряд со спецодеждой, стажировкой и наставником — пока Excel. Инструктажи, ознакомление в поле и обучение они относят к процессам, которые надо переводить, но не хотят завязывать на внешний контур. Мешают отсутствие понятных правил, запрет выносить документы наружу, нет связи на карьере и несвязанные системы. Чтобы сдвинуться, им нужны правила до затрат, подпись внутри своей системы «нажал и подписал» и связь либо отдельный порядок для выезда.</w:t>
       </w:r>
     </w:p>
     <w:p>
@@ -1092,7 +1092,7 @@
           <w:i w:val="0"/>
           <w:sz w:val="24"/>
         </w:rPr>
-        <w:t>Ответ: Электронно знакомят с локальными актами. Блоки документов по должности загружены в кадровый контур и поднимаются при приёме и переводе. Работнику приходит задача в КЭДО, он подписывает. Не подписал — напоминание каждый день, затем аннулирование; можно вернуть на подписание и можно отказаться, написав причину. Массовая рассылка идёт после подписи руководителя. Дата и время именно ознакомления отдельной фразой не названы, фиксируется срок и факт просрочки. Офисным выдают ноутбуки и корпоративную сеть, стационарные компьютеры — нет. Для обязательной фиксации в поле устройства собираются закупать; личный телефон годится, чтобы посмотреть нормы и обучение в личном кабинете, но не как норма для обязательной подписи. Интерфейс должен быть простым. Полноценно не получается ознакомить там, где нет связи перед выездом на карьер. Личные карточки ещё не в этом контуре. На предприятиях человек проходит 21–45 ознакомлений.</w:t>
+        <w:t>Ответ: Электронно знакомят с локальными актами. Работнику приходит задача в КЭДО, он подписывает. Не подписал — напоминание каждый день, затем аннулирование; можно вернуть на подписание и можно отказаться, написав причину. Массовая рассылка идёт после подписи руководителя. Дата и время именно ознакомления отдельной фразой не названы, фиксируется срок и факт просрочки. Для обязательной фиксации в поле устройства собираются закупать; личный телефон годится, чтобы посмотреть нормы и обучение в личном кабинете, но не как норма для обязательной подписи. Интерфейс должен быть простым. Полноценно не получается ознакомить там, где нет связи перед выездом на карьер. На предприятиях человек проходит 21–45 ознакомлений.</w:t>
       </w:r>
     </w:p>
     <w:p>

</xml_diff>